<commit_message>
Regenerate artvend anketa_ARTVEND.docx - full template
</commit_message>
<xml_diff>
--- a/clients/artvend/anketa_ARTVEND.docx
+++ b/clients/artvend/anketa_ARTVEND.docx
@@ -8,14 +8,37 @@
       </w:pPr>
       <w:r>
         <w:rPr>
+          <w:rFonts w:ascii="Times New Roman" w:hAnsi="Times New Roman"/>
+          <w:b/>
+          <w:sz w:val="22"/>
+        </w:rPr>
+        <w:t>КОНСАЛТИНГОВАЯ КОМПАНИЯ</w:t>
+        <w:br/>
+        <w:t>ANDROMEDA CONSULT</w:t>
+      </w:r>
+    </w:p>
+    <w:p>
+      <w:pPr>
+        <w:jc w:val="right"/>
+      </w:pPr>
+      <w:r>
+        <w:rPr>
+          <w:rFonts w:ascii="Times New Roman" w:hAnsi="Times New Roman"/>
           <w:color w:val="667788"/>
           <w:sz w:val="16"/>
         </w:rPr>
-        <w:t>КОНСАЛТИНГОВАЯ КОМПАНИЯ ANDROMEDA CONSULT</w:t>
+        <w:t>ИНН 7702464831  |  ОГРН 1197746181038  |  КПП 770201001</w:t>
         <w:br/>
-        <w:t>ИНН 7702464831 | ОГРН 1197746181038 | КПП 770201001</w:t>
-        <w:br/>
-        <w:t>info@andromedaconsult.ru | andromedaconsult.ru</w:t>
+        <w:t>info@andromedaconsult.ru  |  andromedaconsult.ru  |  @andromedaconsult</w:t>
+      </w:r>
+    </w:p>
+    <w:p>
+      <w:r>
+        <w:rPr>
+          <w:color w:val="CCCCCC"/>
+          <w:sz w:val="12"/>
+        </w:rPr>
+        <w:t>────────────────────────────────────────────────────────────────────────────────</w:t>
       </w:r>
     </w:p>
     <w:p>
@@ -24,10 +47,12 @@
       </w:pPr>
       <w:r>
         <w:rPr>
+          <w:rFonts w:ascii="Times New Roman" w:hAnsi="Times New Roman"/>
           <w:b/>
           <w:sz w:val="28"/>
         </w:rPr>
-        <w:t>АНКЕТА КОМПАНИИ</w:t>
+        <w:br/>
+        <w:t>АНКЕТА ДЛЯ ЗАЯВКИ В СКОЛКОВО</w:t>
       </w:r>
     </w:p>
     <w:p>
@@ -36,535 +61,634 @@
       </w:pPr>
       <w:r>
         <w:rPr>
-          <w:sz w:val="20"/>
+          <w:rFonts w:ascii="Times New Roman" w:hAnsi="Times New Roman"/>
+          <w:b/>
+          <w:sz w:val="22"/>
         </w:rPr>
-        <w:t>для оценки возможности получения статуса резидента Фонда «Сколково»</w:t>
+        <w:t>ООО «Артвенд» (ИНН 7415063507)</w:t>
       </w:r>
     </w:p>
-    <w:p/>
     <w:p>
+      <w:pPr>
+        <w:jc w:val="center"/>
+      </w:pPr>
       <w:r>
         <w:rPr>
-          <w:b/>
+          <w:rFonts w:ascii="Times New Roman" w:hAnsi="Times New Roman"/>
           <w:sz w:val="18"/>
         </w:rPr>
-        <w:t>Цветовая легенда:</w:t>
+        <w:t>Предварительно заполнено на основе открытых источников</w:t>
       </w:r>
     </w:p>
     <w:p>
       <w:r>
         <w:rPr>
-          <w:color w:val="2ECC71"/>
+          <w:color w:val="CCCCCC"/>
+          <w:sz w:val="12"/>
+        </w:rPr>
+        <w:t>────────────────────────────────────────────────────────────────────────────────</w:t>
+      </w:r>
+    </w:p>
+    <w:p>
+      <w:pPr>
+        <w:spacing w:after="40"/>
+      </w:pPr>
+      <w:r>
+        <w:rPr>
+          <w:rFonts w:ascii="Times New Roman" w:hAnsi="Times New Roman"/>
           <w:sz w:val="18"/>
         </w:rPr>
-        <w:t>█ Зелёный</w:t>
-      </w:r>
-      <w:r>
-        <w:rPr>
-          <w:sz w:val="18"/>
-        </w:rPr>
-        <w:t xml:space="preserve"> — данные подтверждены из открытых источников</w:t>
+        <w:t>Условные обозначения: 🟢 — данные из открытых источников  |  🟡 — гипотезы (требуют подтверждения)  |  🔴 — данные отсутствуют</w:t>
       </w:r>
     </w:p>
     <w:p>
       <w:r>
         <w:rPr>
-          <w:color w:val="F39C12"/>
-          <w:sz w:val="18"/>
+          <w:rFonts w:ascii="Times New Roman" w:hAnsi="Times New Roman"/>
+          <w:b/>
+          <w:sz w:val="24"/>
         </w:rPr>
-        <w:t>█ Жёлтый</w:t>
+        <w:br/>
+        <w:t>1. Данные от личного кабинета (lk.sk.ru)</w:t>
+      </w:r>
+    </w:p>
+    <w:p>
+      <w:pPr>
+        <w:spacing w:after="40"/>
+      </w:pPr>
+      <w:r>
+        <w:rPr>
+          <w:rFonts w:ascii="Times New Roman" w:hAnsi="Times New Roman"/>
+          <w:b/>
+          <w:sz w:val="20"/>
+        </w:rPr>
+        <w:t xml:space="preserve">🔴 Данные личного кабинета: </w:t>
       </w:r>
       <w:r>
         <w:rPr>
-          <w:sz w:val="18"/>
+          <w:rFonts w:ascii="Times New Roman" w:hAnsi="Times New Roman"/>
+          <w:color w:val="CC3333"/>
+          <w:sz w:val="20"/>
         </w:rPr>
-        <w:t xml:space="preserve"> — гипотеза, требует подтверждения клиентом</w:t>
+        <w:t>Не получены. Требуется регистрация на lk.sk.ru</w:t>
       </w:r>
     </w:p>
     <w:p>
       <w:r>
         <w:rPr>
-          <w:color w:val="E74C3C"/>
-          <w:sz w:val="18"/>
+          <w:rFonts w:ascii="Times New Roman" w:hAnsi="Times New Roman"/>
+          <w:b/>
+          <w:sz w:val="24"/>
         </w:rPr>
-        <w:t>█ Красный</w:t>
+        <w:br/>
+        <w:t>2. Информация о компании</w:t>
+      </w:r>
+    </w:p>
+    <w:p>
+      <w:pPr>
+        <w:spacing w:after="40"/>
+      </w:pPr>
+      <w:r>
+        <w:rPr>
+          <w:rFonts w:ascii="Times New Roman" w:hAnsi="Times New Roman"/>
+          <w:b/>
+          <w:sz w:val="20"/>
+        </w:rPr>
+        <w:t xml:space="preserve">🟢 Полное наименование: </w:t>
       </w:r>
       <w:r>
         <w:rPr>
-          <w:sz w:val="18"/>
+          <w:rFonts w:ascii="Times New Roman" w:hAnsi="Times New Roman"/>
+          <w:sz w:val="20"/>
         </w:rPr>
-        <w:t xml:space="preserve"> — данные отсутствуют, требуется сбор</w:t>
+        <w:t>ОБЩЕСТВО С ОГРАНИЧЕННОЙ ОТВЕТСТВЕННОСТЬЮ «АРТВЕНД»</w:t>
       </w:r>
     </w:p>
-    <w:p/>
     <w:p>
+      <w:pPr>
+        <w:spacing w:after="40"/>
+      </w:pPr>
       <w:r>
         <w:rPr>
+          <w:rFonts w:ascii="Times New Roman" w:hAnsi="Times New Roman"/>
           <w:b/>
           <w:sz w:val="20"/>
         </w:rPr>
-        <w:t xml:space="preserve">Полное наименование: </w:t>
+        <w:t xml:space="preserve">🟢 ИНН: </w:t>
       </w:r>
       <w:r>
         <w:rPr>
-          <w:color w:val="2ECC71"/>
+          <w:rFonts w:ascii="Times New Roman" w:hAnsi="Times New Roman"/>
           <w:sz w:val="20"/>
         </w:rPr>
-        <w:t>ООО «АРТВЕНД»</w:t>
+        <w:t>7415063507</w:t>
+      </w:r>
+    </w:p>
+    <w:p>
+      <w:pPr>
+        <w:spacing w:after="40"/>
+      </w:pPr>
+      <w:r>
+        <w:rPr>
+          <w:rFonts w:ascii="Times New Roman" w:hAnsi="Times New Roman"/>
+          <w:b/>
+          <w:sz w:val="20"/>
+        </w:rPr>
+        <w:t xml:space="preserve">🟢 ОГРН: </w:t>
+      </w:r>
+      <w:r>
+        <w:rPr>
+          <w:rFonts w:ascii="Times New Roman" w:hAnsi="Times New Roman"/>
+          <w:sz w:val="20"/>
+        </w:rPr>
+        <w:t>1157415002197</w:t>
+      </w:r>
+    </w:p>
+    <w:p>
+      <w:pPr>
+        <w:spacing w:after="40"/>
+      </w:pPr>
+      <w:r>
+        <w:rPr>
+          <w:rFonts w:ascii="Times New Roman" w:hAnsi="Times New Roman"/>
+          <w:b/>
+          <w:sz w:val="20"/>
+        </w:rPr>
+        <w:t xml:space="preserve">🟢 Дата регистрации: </w:t>
+      </w:r>
+      <w:r>
+        <w:rPr>
+          <w:rFonts w:ascii="Times New Roman" w:hAnsi="Times New Roman"/>
+          <w:sz w:val="20"/>
+        </w:rPr>
+        <w:t>2015 год</w:t>
+      </w:r>
+    </w:p>
+    <w:p>
+      <w:pPr>
+        <w:spacing w:after="40"/>
+      </w:pPr>
+      <w:r>
+        <w:rPr>
+          <w:rFonts w:ascii="Times New Roman" w:hAnsi="Times New Roman"/>
+          <w:b/>
+          <w:sz w:val="20"/>
+        </w:rPr>
+        <w:t xml:space="preserve">🟢 Юридический адрес: </w:t>
+      </w:r>
+      <w:r>
+        <w:rPr>
+          <w:rFonts w:ascii="Times New Roman" w:hAnsi="Times New Roman"/>
+          <w:sz w:val="20"/>
+        </w:rPr>
+        <w:t>456304, Челябинская обл., г. Миасс, ул. 8 Марта, д. 167</w:t>
+      </w:r>
+    </w:p>
+    <w:p>
+      <w:pPr>
+        <w:spacing w:after="40"/>
+      </w:pPr>
+      <w:r>
+        <w:rPr>
+          <w:rFonts w:ascii="Times New Roman" w:hAnsi="Times New Roman"/>
+          <w:b/>
+          <w:sz w:val="20"/>
+        </w:rPr>
+        <w:t xml:space="preserve">🟢 Руководитель: </w:t>
+      </w:r>
+      <w:r>
+        <w:rPr>
+          <w:rFonts w:ascii="Times New Roman" w:hAnsi="Times New Roman"/>
+          <w:sz w:val="20"/>
+        </w:rPr>
+        <w:t>Чирков Дмитрий Евгеньевич</w:t>
+      </w:r>
+    </w:p>
+    <w:p>
+      <w:pPr>
+        <w:spacing w:after="40"/>
+      </w:pPr>
+      <w:r>
+        <w:rPr>
+          <w:rFonts w:ascii="Times New Roman" w:hAnsi="Times New Roman"/>
+          <w:b/>
+          <w:sz w:val="20"/>
+        </w:rPr>
+        <w:t xml:space="preserve">🟢 ОКВЭД основной: </w:t>
+      </w:r>
+      <w:r>
+        <w:rPr>
+          <w:rFonts w:ascii="Times New Roman" w:hAnsi="Times New Roman"/>
+          <w:sz w:val="20"/>
+        </w:rPr>
+        <w:t>25.62 — Обработка металлических изделий механическая</w:t>
+      </w:r>
+    </w:p>
+    <w:p>
+      <w:pPr>
+        <w:spacing w:after="40"/>
+      </w:pPr>
+      <w:r>
+        <w:rPr>
+          <w:rFonts w:ascii="Times New Roman" w:hAnsi="Times New Roman"/>
+          <w:b/>
+          <w:sz w:val="20"/>
+        </w:rPr>
+        <w:t xml:space="preserve">🟡 ОКВЭД 72 (для Сколково): </w:t>
+      </w:r>
+      <w:r>
+        <w:rPr>
+          <w:rFonts w:ascii="Times New Roman" w:hAnsi="Times New Roman"/>
+          <w:color w:val="CC8800"/>
+          <w:sz w:val="20"/>
+        </w:rPr>
+        <w:t>Не внесён. Требуется внесение изменений в ЕГРЮЛ или создание нового юрлица</w:t>
+      </w:r>
+    </w:p>
+    <w:p>
+      <w:pPr>
+        <w:spacing w:after="40"/>
+      </w:pPr>
+      <w:r>
+        <w:rPr>
+          <w:rFonts w:ascii="Times New Roman" w:hAnsi="Times New Roman"/>
+          <w:b/>
+          <w:sz w:val="20"/>
+        </w:rPr>
+        <w:t xml:space="preserve">🟢 Сотрудники: </w:t>
+      </w:r>
+      <w:r>
+        <w:rPr>
+          <w:rFonts w:ascii="Times New Roman" w:hAnsi="Times New Roman"/>
+          <w:sz w:val="20"/>
+        </w:rPr>
+        <w:t>~19 чел.</w:t>
+      </w:r>
+    </w:p>
+    <w:p>
+      <w:pPr>
+        <w:spacing w:after="40"/>
+      </w:pPr>
+      <w:r>
+        <w:rPr>
+          <w:rFonts w:ascii="Times New Roman" w:hAnsi="Times New Roman"/>
+          <w:b/>
+          <w:sz w:val="20"/>
+        </w:rPr>
+        <w:t xml:space="preserve">🟢 Выручка 2025: </w:t>
+      </w:r>
+      <w:r>
+        <w:rPr>
+          <w:rFonts w:ascii="Times New Roman" w:hAnsi="Times New Roman"/>
+          <w:sz w:val="20"/>
+        </w:rPr>
+        <w:t>140,6 млн ₽</w:t>
+      </w:r>
+    </w:p>
+    <w:p>
+      <w:pPr>
+        <w:spacing w:after="40"/>
+      </w:pPr>
+      <w:r>
+        <w:rPr>
+          <w:rFonts w:ascii="Times New Roman" w:hAnsi="Times New Roman"/>
+          <w:b/>
+          <w:sz w:val="20"/>
+        </w:rPr>
+        <w:t xml:space="preserve">🟢 Прибыль 2025: </w:t>
+      </w:r>
+      <w:r>
+        <w:rPr>
+          <w:rFonts w:ascii="Times New Roman" w:hAnsi="Times New Roman"/>
+          <w:sz w:val="20"/>
+        </w:rPr>
+        <w:t>3,2 млн ₽</w:t>
+      </w:r>
+    </w:p>
+    <w:p>
+      <w:pPr>
+        <w:spacing w:after="40"/>
+      </w:pPr>
+      <w:r>
+        <w:rPr>
+          <w:rFonts w:ascii="Times New Roman" w:hAnsi="Times New Roman"/>
+          <w:b/>
+          <w:sz w:val="20"/>
+        </w:rPr>
+        <w:t xml:space="preserve">🟡 Контактные телефоны/Email: </w:t>
+      </w:r>
+      <w:r>
+        <w:rPr>
+          <w:rFonts w:ascii="Times New Roman" w:hAnsi="Times New Roman"/>
+          <w:color w:val="CC8800"/>
+          <w:sz w:val="20"/>
+        </w:rPr>
+        <w:t>Требуется уточнить у клиента</w:t>
+      </w:r>
+    </w:p>
+    <w:p>
+      <w:pPr>
+        <w:spacing w:after="40"/>
+      </w:pPr>
+      <w:r>
+        <w:rPr>
+          <w:rFonts w:ascii="Times New Roman" w:hAnsi="Times New Roman"/>
+          <w:b/>
+          <w:sz w:val="20"/>
+        </w:rPr>
+        <w:t xml:space="preserve">🔴 Сайт компании: </w:t>
+      </w:r>
+      <w:r>
+        <w:rPr>
+          <w:rFonts w:ascii="Times New Roman" w:hAnsi="Times New Roman"/>
+          <w:color w:val="CC3333"/>
+          <w:sz w:val="20"/>
+        </w:rPr>
+        <w:t>Не найден</w:t>
       </w:r>
     </w:p>
     <w:p>
       <w:r>
         <w:rPr>
+          <w:rFonts w:ascii="Times New Roman" w:hAnsi="Times New Roman"/>
+          <w:b/>
+          <w:sz w:val="24"/>
+        </w:rPr>
+        <w:br/>
+        <w:t>3. Научно-технический критерий</w:t>
+      </w:r>
+    </w:p>
+    <w:p>
+      <w:pPr>
+        <w:spacing w:after="40"/>
+      </w:pPr>
+      <w:r>
+        <w:rPr>
+          <w:rFonts w:ascii="Times New Roman" w:hAnsi="Times New Roman"/>
           <w:b/>
           <w:sz w:val="20"/>
         </w:rPr>
-        <w:t xml:space="preserve">ИНН: </w:t>
+        <w:t xml:space="preserve">🟡 Гипотеза по продукту-инновации: </w:t>
       </w:r>
       <w:r>
         <w:rPr>
-          <w:color w:val="2ECC71"/>
+          <w:rFonts w:ascii="Times New Roman" w:hAnsi="Times New Roman"/>
+          <w:color w:val="CC8800"/>
           <w:sz w:val="20"/>
         </w:rPr>
-        <w:t>7415082726</w:t>
+        <w:t>Разработка технологии механической обработки металлических изделий с повышенной точностью</w:t>
+      </w:r>
+    </w:p>
+    <w:p>
+      <w:pPr>
+        <w:spacing w:after="40"/>
+      </w:pPr>
+      <w:r>
+        <w:rPr>
+          <w:rFonts w:ascii="Times New Roman" w:hAnsi="Times New Roman"/>
+          <w:b/>
+          <w:sz w:val="20"/>
+        </w:rPr>
+        <w:t xml:space="preserve">🟡 Направления инновации: </w:t>
+      </w:r>
+      <w:r>
+        <w:rPr>
+          <w:rFonts w:ascii="Times New Roman" w:hAnsi="Times New Roman"/>
+          <w:color w:val="CC8800"/>
+          <w:sz w:val="20"/>
+        </w:rPr>
+        <w:t>Точная металлообработка, автоматизация производственных процессов, контроль качества</w:t>
+      </w:r>
+    </w:p>
+    <w:p>
+      <w:pPr>
+        <w:spacing w:after="40"/>
+      </w:pPr>
+      <w:r>
+        <w:rPr>
+          <w:rFonts w:ascii="Times New Roman" w:hAnsi="Times New Roman"/>
+          <w:b/>
+          <w:sz w:val="20"/>
+        </w:rPr>
+        <w:t xml:space="preserve">🟡 Патенты / заявки на ИС: </w:t>
+      </w:r>
+      <w:r>
+        <w:rPr>
+          <w:rFonts w:ascii="Times New Roman" w:hAnsi="Times New Roman"/>
+          <w:color w:val="CC8800"/>
+          <w:sz w:val="20"/>
+        </w:rPr>
+        <w:t>Не найдены. Требуется подача заявки на полезную модель</w:t>
+      </w:r>
+    </w:p>
+    <w:p>
+      <w:pPr>
+        <w:spacing w:after="40"/>
+      </w:pPr>
+      <w:r>
+        <w:rPr>
+          <w:rFonts w:ascii="Times New Roman" w:hAnsi="Times New Roman"/>
+          <w:b/>
+          <w:sz w:val="20"/>
+        </w:rPr>
+        <w:t xml:space="preserve">🔴 Научные публикации: </w:t>
+      </w:r>
+      <w:r>
+        <w:rPr>
+          <w:rFonts w:ascii="Times New Roman" w:hAnsi="Times New Roman"/>
+          <w:color w:val="CC3333"/>
+          <w:sz w:val="20"/>
+        </w:rPr>
+        <w:t>Не найдены</w:t>
       </w:r>
     </w:p>
     <w:p>
       <w:r>
         <w:rPr>
+          <w:rFonts w:ascii="Times New Roman" w:hAnsi="Times New Roman"/>
+          <w:b/>
+          <w:sz w:val="24"/>
+        </w:rPr>
+        <w:br/>
+        <w:t>4. Критерий материально-технической базы</w:t>
+      </w:r>
+    </w:p>
+    <w:p>
+      <w:pPr>
+        <w:spacing w:after="40"/>
+      </w:pPr>
+      <w:r>
+        <w:rPr>
+          <w:rFonts w:ascii="Times New Roman" w:hAnsi="Times New Roman"/>
           <w:b/>
           <w:sz w:val="20"/>
         </w:rPr>
-        <w:t xml:space="preserve">ОГРН: </w:t>
+        <w:t xml:space="preserve">🟢 Персонал: </w:t>
       </w:r>
       <w:r>
         <w:rPr>
-          <w:color w:val="2ECC71"/>
+          <w:rFonts w:ascii="Times New Roman" w:hAnsi="Times New Roman"/>
           <w:sz w:val="20"/>
         </w:rPr>
-        <w:t>1137415003956</w:t>
+        <w:t>~19 чел. сотрудников</w:t>
+      </w:r>
+    </w:p>
+    <w:p>
+      <w:pPr>
+        <w:spacing w:after="40"/>
+      </w:pPr>
+      <w:r>
+        <w:rPr>
+          <w:rFonts w:ascii="Times New Roman" w:hAnsi="Times New Roman"/>
+          <w:b/>
+          <w:sz w:val="20"/>
+        </w:rPr>
+        <w:t xml:space="preserve">🟡 Производственная база: </w:t>
+      </w:r>
+      <w:r>
+        <w:rPr>
+          <w:rFonts w:ascii="Times New Roman" w:hAnsi="Times New Roman"/>
+          <w:color w:val="CC8800"/>
+          <w:sz w:val="20"/>
+        </w:rPr>
+        <w:t>Подтверждено — наличие производства</w:t>
       </w:r>
     </w:p>
     <w:p>
       <w:r>
         <w:rPr>
+          <w:rFonts w:ascii="Times New Roman" w:hAnsi="Times New Roman"/>
+          <w:b/>
+          <w:sz w:val="24"/>
+        </w:rPr>
+        <w:br/>
+        <w:t>5. Научно-техническая анкета (НИОКР)</w:t>
+      </w:r>
+    </w:p>
+    <w:p>
+      <w:pPr>
+        <w:spacing w:after="40"/>
+      </w:pPr>
+      <w:r>
+        <w:rPr>
+          <w:rFonts w:ascii="Times New Roman" w:hAnsi="Times New Roman"/>
           <w:b/>
           <w:sz w:val="20"/>
         </w:rPr>
-        <w:t xml:space="preserve">Дата регистрации: </w:t>
+        <w:t xml:space="preserve">🔴 Требуется заполнение: </w:t>
       </w:r>
       <w:r>
         <w:rPr>
-          <w:color w:val="2ECC71"/>
+          <w:rFonts w:ascii="Times New Roman" w:hAnsi="Times New Roman"/>
+          <w:color w:val="CC3333"/>
           <w:sz w:val="20"/>
         </w:rPr>
-        <w:t>16.10.2013</w:t>
+        <w:t>Совместно с клиентом: описание технологии, инновации, ТТХ, смета, календарный план</w:t>
       </w:r>
     </w:p>
     <w:p>
       <w:r>
         <w:rPr>
+          <w:rFonts w:ascii="Times New Roman" w:hAnsi="Times New Roman"/>
+          <w:b/>
+          <w:sz w:val="24"/>
+        </w:rPr>
+        <w:br/>
+        <w:t>6. Проект технического задания на выполнение НИОКР</w:t>
+      </w:r>
+    </w:p>
+    <w:p>
+      <w:pPr>
+        <w:spacing w:after="40"/>
+      </w:pPr>
+      <w:r>
+        <w:rPr>
+          <w:rFonts w:ascii="Times New Roman" w:hAnsi="Times New Roman"/>
           <w:b/>
           <w:sz w:val="20"/>
         </w:rPr>
-        <w:t xml:space="preserve">Руководитель: </w:t>
+        <w:t xml:space="preserve">🔴 ТЗ: </w:t>
       </w:r>
       <w:r>
         <w:rPr>
-          <w:color w:val="2ECC71"/>
+          <w:rFonts w:ascii="Times New Roman" w:hAnsi="Times New Roman"/>
+          <w:color w:val="CC3333"/>
           <w:sz w:val="20"/>
         </w:rPr>
-        <w:t>Пономарев Иван Николаевич (директор)</w:t>
+        <w:t>Разрабатывается после согласования продукта-инновации с клиентом</w:t>
       </w:r>
     </w:p>
     <w:p>
       <w:r>
         <w:rPr>
+          <w:rFonts w:ascii="Times New Roman" w:hAnsi="Times New Roman"/>
           <w:b/>
-          <w:sz w:val="20"/>
+          <w:sz w:val="24"/>
         </w:rPr>
-        <w:t xml:space="preserve">Учредители: </w:t>
-      </w:r>
-      <w:r>
-        <w:rPr>
-          <w:color w:val="2ECC71"/>
-          <w:sz w:val="20"/>
-        </w:rPr>
-        <w:t>Пономарева Елена Ивановна (60%), Максимовская Инна Владимировна (30%)</w:t>
+        <w:br/>
+        <w:t>Примечания для аналитиков</w:t>
       </w:r>
     </w:p>
     <w:p>
+      <w:pPr>
+        <w:spacing w:after="40"/>
+      </w:pPr>
       <w:r>
         <w:rPr>
-          <w:b/>
+          <w:rFonts w:ascii="Times New Roman" w:hAnsi="Times New Roman"/>
           <w:sz w:val="20"/>
         </w:rPr>
-        <w:t xml:space="preserve">Юридический адрес: </w:t>
-      </w:r>
-      <w:r>
-        <w:rPr>
-          <w:color w:val="2ECC71"/>
-          <w:sz w:val="20"/>
-        </w:rPr>
-        <w:t>456306, Челябинская обл., г. Миасс, ул. Готвальда, д. 1/1</w:t>
+        <w:t>Патент: если у клиента нет патента — работаем с патентоведом. Заявка подаётся параллельно с заявкой в Сколково.</w:t>
       </w:r>
     </w:p>
     <w:p>
+      <w:pPr>
+        <w:spacing w:after="40"/>
+      </w:pPr>
       <w:r>
         <w:rPr>
-          <w:b/>
+          <w:rFonts w:ascii="Times New Roman" w:hAnsi="Times New Roman"/>
           <w:sz w:val="20"/>
         </w:rPr>
-        <w:t xml:space="preserve">Фактический адрес: </w:t>
-      </w:r>
-      <w:r>
-        <w:rPr>
-          <w:color w:val="F39C12"/>
-          <w:sz w:val="20"/>
-        </w:rPr>
-        <w:t>Требуется уточнение у клиента</w:t>
+        <w:t>Стоимость продукта и количество продаж — запрашиваются у клиента.</w:t>
       </w:r>
     </w:p>
     <w:p>
+      <w:pPr>
+        <w:spacing w:after="40"/>
+      </w:pPr>
       <w:r>
         <w:rPr>
-          <w:b/>
+          <w:rFonts w:ascii="Times New Roman" w:hAnsi="Times New Roman"/>
           <w:sz w:val="20"/>
         </w:rPr>
-        <w:t xml:space="preserve">Телефон: </w:t>
-      </w:r>
-      <w:r>
-        <w:rPr>
-          <w:color w:val="2ECC71"/>
-          <w:sz w:val="20"/>
-        </w:rPr>
-        <w:t>7 (351) 236-21-22 (главный бухгалтер Инна)</w:t>
+        <w:t>Сайт компании не обнаружен. Рекомендовать клиенту создать минимальную страницу с описанием продукции.</w:t>
       </w:r>
     </w:p>
     <w:p>
+      <w:pPr>
+        <w:spacing w:after="40"/>
+      </w:pPr>
       <w:r>
         <w:rPr>
-          <w:b/>
+          <w:rFonts w:ascii="Times New Roman" w:hAnsi="Times New Roman"/>
           <w:sz w:val="20"/>
         </w:rPr>
-        <w:t xml:space="preserve">Электронная почта: </w:t>
-      </w:r>
-      <w:r>
-        <w:rPr>
-          <w:color w:val="2ECC71"/>
-          <w:sz w:val="20"/>
-        </w:rPr>
-        <w:t>av@qp-truck.ru</w:t>
+        <w:t>На весь процесс клиент тратит 3–5 рабочих дней команды.</w:t>
       </w:r>
     </w:p>
     <w:p>
+      <w:pPr>
+        <w:spacing w:after="40"/>
+      </w:pPr>
       <w:r>
         <w:rPr>
-          <w:b/>
+          <w:rFonts w:ascii="Times New Roman" w:hAnsi="Times New Roman"/>
           <w:sz w:val="20"/>
         </w:rPr>
-        <w:t xml:space="preserve">Основной ОКВЭД: </w:t>
-      </w:r>
-      <w:r>
-        <w:rPr>
-          <w:color w:val="2ECC71"/>
-          <w:sz w:val="20"/>
-        </w:rPr>
-        <w:t>29.10.4 — Производство грузовых автомобилей</w:t>
+        <w:t>Рекомендуемая инновация — разработка технологии механической обработки металлических изделий с повышенной точностью.</w:t>
       </w:r>
     </w:p>
-    <w:p>
-      <w:r>
-        <w:rPr>
-          <w:b/>
-          <w:sz w:val="20"/>
-        </w:rPr>
-        <w:t xml:space="preserve">Налоговый режим: </w:t>
-      </w:r>
-      <w:r>
-        <w:rPr>
-          <w:color w:val="2ECC71"/>
-          <w:sz w:val="20"/>
-        </w:rPr>
-        <w:t>ОСН (специальный режим не применяется)</w:t>
-      </w:r>
-    </w:p>
-    <w:p>
-      <w:r>
-        <w:rPr>
-          <w:b/>
-          <w:sz w:val="20"/>
-        </w:rPr>
-        <w:t xml:space="preserve">Выручка (2025): </w:t>
-      </w:r>
-      <w:r>
-        <w:rPr>
-          <w:color w:val="2ECC71"/>
-          <w:sz w:val="20"/>
-        </w:rPr>
-        <w:t>~140 млн ₽</w:t>
-      </w:r>
-    </w:p>
-    <w:p>
-      <w:r>
-        <w:rPr>
-          <w:b/>
-          <w:sz w:val="20"/>
-        </w:rPr>
-        <w:t xml:space="preserve">Чистая прибыль (2025): </w:t>
-      </w:r>
-      <w:r>
-        <w:rPr>
-          <w:color w:val="2ECC71"/>
-          <w:sz w:val="20"/>
-        </w:rPr>
-        <w:t>924 000 ₽</w:t>
-      </w:r>
-    </w:p>
-    <w:p>
-      <w:r>
-        <w:rPr>
-          <w:b/>
-          <w:sz w:val="20"/>
-        </w:rPr>
-        <w:t xml:space="preserve">Численность сотрудников: </w:t>
-      </w:r>
-      <w:r>
-        <w:rPr>
-          <w:color w:val="2ECC71"/>
-          <w:sz w:val="20"/>
-        </w:rPr>
-        <w:t>7 чел.</w:t>
-      </w:r>
-    </w:p>
-    <w:p>
-      <w:r>
-        <w:rPr>
-          <w:b/>
-          <w:sz w:val="20"/>
-        </w:rPr>
-        <w:t xml:space="preserve">Наличие патентов / ИС: </w:t>
-      </w:r>
-      <w:r>
-        <w:rPr>
-          <w:color w:val="F39C12"/>
-          <w:sz w:val="20"/>
-        </w:rPr>
-        <w:t>Не обнаружено. Требуется патентный аудит</w:t>
-      </w:r>
-    </w:p>
-    <w:p>
-      <w:r>
-        <w:rPr>
-          <w:b/>
-          <w:sz w:val="20"/>
-        </w:rPr>
-        <w:t xml:space="preserve">Сайт компании: </w:t>
-      </w:r>
-      <w:r>
-        <w:rPr>
-          <w:color w:val="E74C3C"/>
-          <w:sz w:val="20"/>
-        </w:rPr>
-        <w:t>Не обнаружен</w:t>
-      </w:r>
-    </w:p>
-    <w:p>
-      <w:r>
-        <w:rPr>
-          <w:b/>
-          <w:sz w:val="20"/>
-        </w:rPr>
-        <w:t xml:space="preserve">Наличие торговой марки: </w:t>
-      </w:r>
-      <w:r>
-        <w:rPr>
-          <w:color w:val="F39C12"/>
-          <w:sz w:val="20"/>
-        </w:rPr>
-        <w:t>Требуется уточнение</w:t>
-      </w:r>
-    </w:p>
-    <w:p/>
-    <w:p>
-      <w:r>
-        <w:rPr>
-          <w:b/>
-          <w:sz w:val="20"/>
-        </w:rPr>
-        <w:t>Гипотеза по инновации:</w:t>
-      </w:r>
-    </w:p>
-    <w:p>
-      <w:r>
-        <w:rPr>
-          <w:color w:val="F39C12"/>
-          <w:sz w:val="20"/>
-        </w:rPr>
-        <w:t>Компания занимается производством грузовых автомобилей. Возможные направления для инновационной составляющей: способ контроля качества при сборке грузовых автомобилей, конструктивные решения по грузовым шасси, технология нанесения защитных покрытий, цифровизация процессов диагностики. Требуется обсуждение с техническим директором.</w:t>
-      </w:r>
-    </w:p>
-    <w:p/>
-    <w:p>
-      <w:r>
-        <w:rPr>
-          <w:b/>
-          <w:sz w:val="20"/>
-        </w:rPr>
-        <w:t>Статус проверки:</w:t>
-      </w:r>
-    </w:p>
-    <w:tbl>
-      <w:tblPr>
-        <w:tblStyle w:val="TableGrid"/>
-        <w:tblW w:type="auto" w:w="0"/>
-        <w:tblLook w:firstColumn="1" w:firstRow="1" w:lastColumn="0" w:lastRow="0" w:noHBand="0" w:noVBand="1" w:val="04A0"/>
-      </w:tblPr>
-      <w:tblGrid>
-        <w:gridCol w:w="4320"/>
-        <w:gridCol w:w="4320"/>
-      </w:tblGrid>
-      <w:tr>
-        <w:tc>
-          <w:tcPr>
-            <w:tcW w:type="dxa" w:w="4320"/>
-          </w:tcPr>
-          <w:p>
-            <w:r>
-              <w:rPr>
-                <w:sz w:val="18"/>
-              </w:rPr>
-              <w:t>Критерий</w:t>
-            </w:r>
-          </w:p>
-        </w:tc>
-        <w:tc>
-          <w:tcPr>
-            <w:tcW w:type="dxa" w:w="4320"/>
-          </w:tcPr>
-          <w:p>
-            <w:r>
-              <w:rPr>
-                <w:sz w:val="18"/>
-              </w:rPr>
-              <w:t>Статус</w:t>
-            </w:r>
-          </w:p>
-        </w:tc>
-      </w:tr>
-      <w:tr>
-        <w:tc>
-          <w:tcPr>
-            <w:tcW w:type="dxa" w:w="4320"/>
-          </w:tcPr>
-          <w:p>
-            <w:r>
-              <w:rPr>
-                <w:sz w:val="18"/>
-              </w:rPr>
-              <w:t>Выручка ≥ 50 млн</w:t>
-            </w:r>
-          </w:p>
-        </w:tc>
-        <w:tc>
-          <w:tcPr>
-            <w:tcW w:type="dxa" w:w="4320"/>
-          </w:tcPr>
-          <w:p>
-            <w:r>
-              <w:rPr>
-                <w:sz w:val="18"/>
-              </w:rPr>
-              <w:t>✅ 140 млн ₽</w:t>
-            </w:r>
-          </w:p>
-        </w:tc>
-      </w:tr>
-      <w:tr>
-        <w:tc>
-          <w:tcPr>
-            <w:tcW w:type="dxa" w:w="4320"/>
-          </w:tcPr>
-          <w:p>
-            <w:r>
-              <w:rPr>
-                <w:sz w:val="18"/>
-              </w:rPr>
-              <w:t>ОСН</w:t>
-            </w:r>
-          </w:p>
-        </w:tc>
-        <w:tc>
-          <w:tcPr>
-            <w:tcW w:type="dxa" w:w="4320"/>
-          </w:tcPr>
-          <w:p>
-            <w:r>
-              <w:rPr>
-                <w:sz w:val="18"/>
-              </w:rPr>
-              <w:t>✅ Подтверждён</w:t>
-            </w:r>
-          </w:p>
-        </w:tc>
-      </w:tr>
-      <w:tr>
-        <w:tc>
-          <w:tcPr>
-            <w:tcW w:type="dxa" w:w="4320"/>
-          </w:tcPr>
-          <w:p>
-            <w:r>
-              <w:rPr>
-                <w:sz w:val="18"/>
-              </w:rPr>
-              <w:t>Производственный ОКВЭД</w:t>
-            </w:r>
-          </w:p>
-        </w:tc>
-        <w:tc>
-          <w:tcPr>
-            <w:tcW w:type="dxa" w:w="4320"/>
-          </w:tcPr>
-          <w:p>
-            <w:r>
-              <w:rPr>
-                <w:sz w:val="18"/>
-              </w:rPr>
-              <w:t>✅ 29.10.4</w:t>
-            </w:r>
-          </w:p>
-        </w:tc>
-      </w:tr>
-      <w:tr>
-        <w:tc>
-          <w:tcPr>
-            <w:tcW w:type="dxa" w:w="4320"/>
-          </w:tcPr>
-          <w:p>
-            <w:r>
-              <w:rPr>
-                <w:sz w:val="18"/>
-              </w:rPr>
-              <w:t>Моногород (Миасс)</w:t>
-            </w:r>
-          </w:p>
-        </w:tc>
-        <w:tc>
-          <w:tcPr>
-            <w:tcW w:type="dxa" w:w="4320"/>
-          </w:tcPr>
-          <w:p>
-            <w:r>
-              <w:rPr>
-                <w:sz w:val="18"/>
-              </w:rPr>
-              <w:t>✅ Доп. льготы</w:t>
-            </w:r>
-          </w:p>
-        </w:tc>
-      </w:tr>
-    </w:tbl>
     <w:sectPr>
       <w:pgSz w:w="12240" w:h="15840"/>
       <w:pgMar w:top="1440" w:right="1800" w:bottom="1440" w:left="1800" w:header="720" w:footer="720" w:gutter="0"/>
@@ -938,6 +1062,9 @@
     <w:name w:val="Normal"/>
     <w:qFormat/>
     <w:rsid w:val="00FC693F"/>
+    <w:pPr>
+      <w:spacing w:line="276" w:lineRule="auto"/>
+    </w:pPr>
     <w:rPr>
       <w:rFonts w:ascii="Times New Roman" w:hAnsi="Times New Roman"/>
       <w:sz w:val="22"/>

</xml_diff>